<commit_message>
Docs: deletions through the flow are permanent (tested); add FLOW_RECYCLE steps; update Runbook and Administrator Guide
Co-Authored-By: Claude Sonnet 5.5 <noreply@anthropic.com>
Claude-Session: https://claude.ai/code/session_01CF7wGekz7VLNXhNo2nnpJB
</commit_message>
<xml_diff>
--- a/docs/guides/1_Administrator_Guide.docx
+++ b/docs/guides/1_Administrator_Guide.docx
@@ -6892,7 +6892,43 @@
                 <w:sz w:val="20"/>
                 <w:szCs w:val="20"/>
               </w:rPr>
-              <w:t xml:space="preserve">The app has no undo. A deleted record might be recoverable from SharePoint, but this is not guaranteed (see the Owner’s Runbook, section “Restoring data”). Tell the system owner at once if you delete the wrong order or shipment, before anyone does more work on it.</w:t>
+              <w:t xml:space="preserve">The app has no undo, and </w:t>
+            </w:r>
+            <w:r>
+              <w:rPr>
+                <w:b/>
+                <w:bCs/>
+                <w:color w:val="1D2939"/>
+                <w:sz w:val="20"/>
+                <w:szCs w:val="20"/>
+              </w:rPr>
+              <w:t xml:space="preserve">a deleted record cannot be recovered from SharePoint</w:t>
+            </w:r>
+            <w:r>
+              <w:rPr>
+                <w:color w:val="1D2939"/>
+                <w:sz w:val="20"/>
+                <w:szCs w:val="20"/>
+              </w:rPr>
+              <w:t xml:space="preserve"> unless the system owner has made the Recycle Bin change described in the Owner’s Runbook (section 9.6). Tested on 8 October 2026: deletions are permanent. Think twice, and prefer </w:t>
+            </w:r>
+            <w:r>
+              <w:rPr>
+                <w:b/>
+                <w:bCs/>
+                <w:color w:val="1D2939"/>
+                <w:sz w:val="20"/>
+                <w:szCs w:val="20"/>
+              </w:rPr>
+              <w:t xml:space="preserve">Cancel PO</w:t>
+            </w:r>
+            <w:r>
+              <w:rPr>
+                <w:color w:val="1D2939"/>
+                <w:sz w:val="20"/>
+                <w:szCs w:val="20"/>
+              </w:rPr>
+              <w:t xml:space="preserve"> to Delete. If you delete the wrong order or shipment, tell the system owner at once; the audit log shows what it contained.</w:t>
             </w:r>
           </w:p>
         </w:tc>

</xml_diff>

<commit_message>
Docs: record that the Recycle Bin change was made and verified
Co-Authored-By: Claude Sonnet 5.5 <noreply@anthropic.com>
Claude-Session: https://claude.ai/code/session_01CF7wGekz7VLNXhNo2nnpJB
</commit_message>
<xml_diff>
--- a/docs/guides/1_Administrator_Guide.docx
+++ b/docs/guides/1_Administrator_Guide.docx
@@ -6892,7 +6892,7 @@
                 <w:sz w:val="20"/>
                 <w:szCs w:val="20"/>
               </w:rPr>
-              <w:t xml:space="preserve">The app has no undo, and </w:t>
+              <w:t xml:space="preserve">The app itself has no undo. A deleted record is moved to SharePoint’s </w:t>
             </w:r>
             <w:r>
               <w:rPr>
@@ -6902,7 +6902,7 @@
                 <w:sz w:val="20"/>
                 <w:szCs w:val="20"/>
               </w:rPr>
-              <w:t xml:space="preserve">a deleted record cannot be recovered from SharePoint</w:t>
+              <w:t xml:space="preserve">Recycle Bin</w:t>
             </w:r>
             <w:r>
               <w:rPr>
@@ -6910,7 +6910,7 @@
                 <w:sz w:val="20"/>
                 <w:szCs w:val="20"/>
               </w:rPr>
-              <w:t xml:space="preserve"> unless the system owner has made the Recycle Bin change described in the Owner’s Runbook (section 9.6). Tested on 8 October 2026: deletions are permanent. Think twice, and prefer </w:t>
+              <w:t xml:space="preserve">, where the system owner can restore it (normally for 93 days in total; Owner’s Runbook, sections 9 and 9.6). Still, prefer </w:t>
             </w:r>
             <w:r>
               <w:rPr>
@@ -6928,7 +6928,7 @@
                 <w:sz w:val="20"/>
                 <w:szCs w:val="20"/>
               </w:rPr>
-              <w:t xml:space="preserve"> to Delete. If you delete the wrong order or shipment, tell the system owner at once; the audit log shows what it contained.</w:t>
+              <w:t xml:space="preserve"> to Delete. If you delete the wrong order or shipment, tell the system owner at once, before anyone does more work on it, and ask users to refresh after it is restored.</w:t>
             </w:r>
           </w:p>
         </w:tc>

</xml_diff>

<commit_message>
Docs: version 1.8.0, change log and keyboard test
Co-Authored-By: Claude Sonnet 5.5 <noreply@anthropic.com>
Claude-Session: https://claude.ai/code/session_01CF7wGekz7VLNXhNo2nnpJB
</commit_message>
<xml_diff>
--- a/docs/guides/1_Administrator_Guide.docx
+++ b/docs/guides/1_Administrator_Guide.docx
@@ -270,7 +270,7 @@
                 <w:sz w:val="19"/>
                 <w:szCs w:val="19"/>
               </w:rPr>
-              <w:t xml:space="preserve">1.7.9 (the version number is shown at the top right of every screen)</w:t>
+              <w:t xml:space="preserve">1.8.0 (the version number is shown at the top right of every screen)</w:t>
             </w:r>
           </w:p>
         </w:tc>
@@ -1325,7 +1325,7 @@
                 <w:sz w:val="19"/>
                 <w:szCs w:val="19"/>
               </w:rPr>
-              <w:t xml:space="preserve">Version number (e.g. v1.7.9)</w:t>
+              <w:t xml:space="preserve">Version number (e.g. v1.8.0)</w:t>
             </w:r>
           </w:p>
         </w:tc>
@@ -14335,7 +14335,7 @@
         <w:sz w:val="17"/>
         <w:szCs w:val="17"/>
       </w:rPr>
-      <w:t xml:space="preserve">Mentco PO Manager · Administrator Guide · App v1.7.9 · 8 Oct 2026</w:t>
+      <w:t xml:space="preserve">Mentco PO Manager · Administrator Guide · App v1.8.0 · 8 Oct 2026</w:t>
     </w:r>
     <w:r>
       <w:rPr>

</xml_diff>